<commit_message>
Update TCC graduation to Dec 2027, recompile resume PDF, and add 1200x630 Open Graph card for michaelpragsdale.com
</commit_message>
<xml_diff>
--- a/portfolio/documents/resume/mragsdale-resume-blackberg.docx
+++ b/portfolio/documents/resume/mragsdale-resume-blackberg.docx
@@ -718,7 +718,7 @@
         <w:t xml:space="preserve"> </w:t>
       </w:r>
       <w:r>
-        <w:t xml:space="preserve">Associate of Science, Information Technology (Focus: Software Engineering &amp; Web Dev) | Expected Dec 2026</w:t>
+        <w:t xml:space="preserve">Associate of Science, Information Technology (Focus: Software Engineering &amp; Web Dev) | Expected Dec 2027</w:t>
       </w:r>
     </w:p>
     <w:p>
@@ -741,6 +741,28 @@
       </w:r>
       <w:r>
         <w:t xml:space="preserve">Bachelor of Science, Customized Studies in Leadership | Prior Coursework</w:t>
+      </w:r>
+    </w:p>
+    <w:p>
+      <w:pPr>
+        <w:pStyle w:val="Compact"/>
+        <w:numPr>
+          <w:ilvl w:val="0"/>
+          <w:numId w:val="1006"/>
+        </w:numPr>
+      </w:pPr>
+      <w:r>
+        <w:rPr>
+          <w:b/>
+          <w:bCs/>
+        </w:rPr>
+        <w:t xml:space="preserve">Wilson Workforce and Rehabilitation Center (formerly Woodrow Wilson Rehabilitation Center) | Fishersville, VA</w:t>
+      </w:r>
+      <w:r>
+        <w:t xml:space="preserve"> </w:t>
+      </w:r>
+      <w:r>
+        <w:t xml:space="preserve">Certificate, Business &amp; Information Technology | 2011</w:t>
       </w:r>
     </w:p>
     <w:bookmarkEnd w:id="17"/>

</xml_diff>